<commit_message>
docs: sync both finalized Chapter 8 & 9 docx files
</commit_message>
<xml_diff>
--- a/docs/design/CHUONG_8_9_BAO_CAO_HOAN_CHINH.docx
+++ b/docs/design/CHUONG_8_9_BAO_CAO_HOAN_CHINH.docx
@@ -28,7 +28,7 @@
           <w:color w:val="1E3A8A"/>
           <w:sz w:val="28"/>
         </w:rPr>
-        <w:t>8.1 Môi Trường và Công Nghệ Sử Dụng</w:t>
+        <w:t>8.1 Cấu Hình Môi Trường Thực Thi &amp; Cấu Trúc Mã Nguồn</w:t>
       </w:r>
     </w:p>
     <w:p>
@@ -41,659 +41,166 @@
           <w:rFonts w:ascii="Times New Roman" w:hAnsi="Times New Roman"/>
           <w:sz w:val="26"/>
         </w:rPr>
-        <w:t>Hệ thống Quản lý Trung tâm Ngoại ngữ tích hợp Trí tuệ Nhân tạo (ETC English LMS AI) được thiết kế và xây dựng theo mô hình phân tán hiện đại (Multi-tier Cloud-Native Architecture), tách biệt hoàn toàn giữa tầng Trình diễn (Frontend), tầng Xử lý nghiệp vụ (Backend), tầng Dữ liệu (Database Tier) và tầng Trí tuệ nhân tạo (GenAI Engine).</w:t>
+        <w:t>Hệ thống LMS AI được xây dựng theo kiến trúc tách biệt giữa tầng Giao diện (Next.js 14 App Router) và tầng Xử lý nghiệp vụ (NestJS 12 Framework). Dưới đây là các cấu hình môi trường cần thiết để triển khai thực tế:</w:t>
       </w:r>
     </w:p>
-    <w:tbl>
-      <w:tblPr>
-        <w:tblStyle w:val="TableGrid"/>
-        <w:tblW w:type="auto" w:w="0"/>
-        <w:jc w:val="center"/>
-        <w:tblLook w:firstColumn="1" w:firstRow="1" w:lastColumn="0" w:lastRow="0" w:noHBand="0" w:noVBand="1" w:val="04A0"/>
-      </w:tblPr>
-      <w:tblGrid>
-        <w:gridCol w:w="2340"/>
-        <w:gridCol w:w="2340"/>
-        <w:gridCol w:w="2340"/>
-        <w:gridCol w:w="2340"/>
-      </w:tblGrid>
-      <w:tr>
-        <w:tc>
-          <w:tcPr>
-            <w:tcW w:type="dxa" w:w="2340"/>
-            <w:shd w:fill="1E3A8A"/>
-          </w:tcPr>
-          <w:p>
-            <w:pPr>
-              <w:jc w:val="center"/>
-            </w:pPr>
-            <w:r>
-              <w:rPr>
-                <w:rFonts w:ascii="Times New Roman" w:hAnsi="Times New Roman"/>
-                <w:b/>
-                <w:color w:val="FFFFFF"/>
-                <w:sz w:val="20"/>
-              </w:rPr>
-              <w:t>Thành phần kiến trúc</w:t>
-            </w:r>
-          </w:p>
-        </w:tc>
-        <w:tc>
-          <w:tcPr>
-            <w:tcW w:type="dxa" w:w="2340"/>
-            <w:shd w:fill="1E3A8A"/>
-          </w:tcPr>
-          <w:p>
-            <w:pPr>
-              <w:jc w:val="center"/>
-            </w:pPr>
-            <w:r>
-              <w:rPr>
-                <w:rFonts w:ascii="Times New Roman" w:hAnsi="Times New Roman"/>
-                <w:b/>
-                <w:color w:val="FFFFFF"/>
-                <w:sz w:val="20"/>
-              </w:rPr>
-              <w:t>Công nghệ / Framework</w:t>
-            </w:r>
-          </w:p>
-        </w:tc>
-        <w:tc>
-          <w:tcPr>
-            <w:tcW w:type="dxa" w:w="2340"/>
-            <w:shd w:fill="1E3A8A"/>
-          </w:tcPr>
-          <w:p>
-            <w:pPr>
-              <w:jc w:val="center"/>
-            </w:pPr>
-            <w:r>
-              <w:rPr>
-                <w:rFonts w:ascii="Times New Roman" w:hAnsi="Times New Roman"/>
-                <w:b/>
-                <w:color w:val="FFFFFF"/>
-                <w:sz w:val="20"/>
-              </w:rPr>
-              <w:t>Phiên bản</w:t>
-            </w:r>
-          </w:p>
-        </w:tc>
-        <w:tc>
-          <w:tcPr>
-            <w:tcW w:type="dxa" w:w="2340"/>
-            <w:shd w:fill="1E3A8A"/>
-          </w:tcPr>
-          <w:p>
-            <w:pPr>
-              <w:jc w:val="center"/>
-            </w:pPr>
-            <w:r>
-              <w:rPr>
-                <w:rFonts w:ascii="Times New Roman" w:hAnsi="Times New Roman"/>
-                <w:b/>
-                <w:color w:val="FFFFFF"/>
-                <w:sz w:val="20"/>
-              </w:rPr>
-              <w:t>Vai trò và Mục đích sử dụng</w:t>
-            </w:r>
-          </w:p>
-        </w:tc>
-      </w:tr>
-      <w:tr>
-        <w:tc>
-          <w:tcPr>
-            <w:tcW w:type="dxa" w:w="2340"/>
-            <w:shd w:fill="F8FAFC"/>
-          </w:tcPr>
-          <w:p>
-            <w:r>
-              <w:rPr>
-                <w:rFonts w:ascii="Times New Roman" w:hAnsi="Times New Roman"/>
-                <w:sz w:val="19"/>
-              </w:rPr>
-              <w:t>Runtime Môi trường</w:t>
-            </w:r>
-          </w:p>
-        </w:tc>
-        <w:tc>
-          <w:tcPr>
-            <w:tcW w:type="dxa" w:w="2340"/>
-            <w:shd w:fill="F8FAFC"/>
-          </w:tcPr>
-          <w:p>
-            <w:r>
-              <w:rPr>
-                <w:rFonts w:ascii="Times New Roman" w:hAnsi="Times New Roman"/>
-                <w:sz w:val="19"/>
-              </w:rPr>
-              <w:t>Node.js (LTS)</w:t>
-            </w:r>
-          </w:p>
-        </w:tc>
-        <w:tc>
-          <w:tcPr>
-            <w:tcW w:type="dxa" w:w="2340"/>
-            <w:shd w:fill="F8FAFC"/>
-          </w:tcPr>
-          <w:p>
-            <w:r>
-              <w:rPr>
-                <w:rFonts w:ascii="Times New Roman" w:hAnsi="Times New Roman"/>
-                <w:sz w:val="19"/>
-              </w:rPr>
-              <w:t>v20.x / v22.x</w:t>
-            </w:r>
-          </w:p>
-        </w:tc>
-        <w:tc>
-          <w:tcPr>
-            <w:tcW w:type="dxa" w:w="2340"/>
-            <w:shd w:fill="F8FAFC"/>
-          </w:tcPr>
-          <w:p>
-            <w:r>
-              <w:rPr>
-                <w:rFonts w:ascii="Times New Roman" w:hAnsi="Times New Roman"/>
-                <w:sz w:val="19"/>
-              </w:rPr>
-              <w:t>Môi trường thực thi JavaScript/TypeScript hiệu năng cao phía máy chủ</w:t>
-            </w:r>
-          </w:p>
-        </w:tc>
-      </w:tr>
-      <w:tr>
-        <w:tc>
-          <w:tcPr>
-            <w:tcW w:type="dxa" w:w="2340"/>
-          </w:tcPr>
-          <w:p>
-            <w:r>
-              <w:rPr>
-                <w:rFonts w:ascii="Times New Roman" w:hAnsi="Times New Roman"/>
-                <w:sz w:val="19"/>
-              </w:rPr>
-              <w:t>Quản lý Gói (Package Manager)</w:t>
-            </w:r>
-          </w:p>
-        </w:tc>
-        <w:tc>
-          <w:tcPr>
-            <w:tcW w:type="dxa" w:w="2340"/>
-          </w:tcPr>
-          <w:p>
-            <w:r>
-              <w:rPr>
-                <w:rFonts w:ascii="Times New Roman" w:hAnsi="Times New Roman"/>
-                <w:sz w:val="19"/>
-              </w:rPr>
-              <w:t>npm</w:t>
-            </w:r>
-          </w:p>
-        </w:tc>
-        <w:tc>
-          <w:tcPr>
-            <w:tcW w:type="dxa" w:w="2340"/>
-          </w:tcPr>
-          <w:p>
-            <w:r>
-              <w:rPr>
-                <w:rFonts w:ascii="Times New Roman" w:hAnsi="Times New Roman"/>
-                <w:sz w:val="19"/>
-              </w:rPr>
-              <w:t>v10.x+</w:t>
-            </w:r>
-          </w:p>
-        </w:tc>
-        <w:tc>
-          <w:tcPr>
-            <w:tcW w:type="dxa" w:w="2340"/>
-          </w:tcPr>
-          <w:p>
-            <w:r>
-              <w:rPr>
-                <w:rFonts w:ascii="Times New Roman" w:hAnsi="Times New Roman"/>
-                <w:sz w:val="19"/>
-              </w:rPr>
-              <w:t>Quản lý và đồng bộ toàn bộ thư viện phụ thuộc của dự án</w:t>
-            </w:r>
-          </w:p>
-        </w:tc>
-      </w:tr>
-      <w:tr>
-        <w:tc>
-          <w:tcPr>
-            <w:tcW w:type="dxa" w:w="2340"/>
-            <w:shd w:fill="F8FAFC"/>
-          </w:tcPr>
-          <w:p>
-            <w:r>
-              <w:rPr>
-                <w:rFonts w:ascii="Times New Roman" w:hAnsi="Times New Roman"/>
-                <w:sz w:val="19"/>
-              </w:rPr>
-              <w:t>Tầng Xử lý Nghiệp vụ (Backend)</w:t>
-            </w:r>
-          </w:p>
-        </w:tc>
-        <w:tc>
-          <w:tcPr>
-            <w:tcW w:type="dxa" w:w="2340"/>
-            <w:shd w:fill="F8FAFC"/>
-          </w:tcPr>
-          <w:p>
-            <w:r>
-              <w:rPr>
-                <w:rFonts w:ascii="Times New Roman" w:hAnsi="Times New Roman"/>
-                <w:sz w:val="19"/>
-              </w:rPr>
-              <w:t>NestJS Framework</w:t>
-            </w:r>
-          </w:p>
-        </w:tc>
-        <w:tc>
-          <w:tcPr>
-            <w:tcW w:type="dxa" w:w="2340"/>
-            <w:shd w:fill="F8FAFC"/>
-          </w:tcPr>
-          <w:p>
-            <w:r>
-              <w:rPr>
-                <w:rFonts w:ascii="Times New Roman" w:hAnsi="Times New Roman"/>
-                <w:sz w:val="19"/>
-              </w:rPr>
-              <w:t>v11.x / v12.x</w:t>
-            </w:r>
-          </w:p>
-        </w:tc>
-        <w:tc>
-          <w:tcPr>
-            <w:tcW w:type="dxa" w:w="2340"/>
-            <w:shd w:fill="F8FAFC"/>
-          </w:tcPr>
-          <w:p>
-            <w:r>
-              <w:rPr>
-                <w:rFonts w:ascii="Times New Roman" w:hAnsi="Times New Roman"/>
-                <w:sz w:val="19"/>
-              </w:rPr>
-              <w:t>Xây dựng 32 RESTful APIs theo kiến trúc Modular, Dependency Injection</w:t>
-            </w:r>
-          </w:p>
-        </w:tc>
-      </w:tr>
-      <w:tr>
-        <w:tc>
-          <w:tcPr>
-            <w:tcW w:type="dxa" w:w="2340"/>
-          </w:tcPr>
-          <w:p>
-            <w:r>
-              <w:rPr>
-                <w:rFonts w:ascii="Times New Roman" w:hAnsi="Times New Roman"/>
-                <w:sz w:val="19"/>
-              </w:rPr>
-              <w:t>Tầng Truy xuất Dữ liệu (ORM)</w:t>
-            </w:r>
-          </w:p>
-        </w:tc>
-        <w:tc>
-          <w:tcPr>
-            <w:tcW w:type="dxa" w:w="2340"/>
-          </w:tcPr>
-          <w:p>
-            <w:r>
-              <w:rPr>
-                <w:rFonts w:ascii="Times New Roman" w:hAnsi="Times New Roman"/>
-                <w:sz w:val="19"/>
-              </w:rPr>
-              <w:t>Prisma ORM</w:t>
-            </w:r>
-          </w:p>
-        </w:tc>
-        <w:tc>
-          <w:tcPr>
-            <w:tcW w:type="dxa" w:w="2340"/>
-          </w:tcPr>
-          <w:p>
-            <w:r>
-              <w:rPr>
-                <w:rFonts w:ascii="Times New Roman" w:hAnsi="Times New Roman"/>
-                <w:sz w:val="19"/>
-              </w:rPr>
-              <w:t>v6.4.1 (Stable)</w:t>
-            </w:r>
-          </w:p>
-        </w:tc>
-        <w:tc>
-          <w:tcPr>
-            <w:tcW w:type="dxa" w:w="2340"/>
-          </w:tcPr>
-          <w:p>
-            <w:r>
-              <w:rPr>
-                <w:rFonts w:ascii="Times New Roman" w:hAnsi="Times New Roman"/>
-                <w:sz w:val="19"/>
-              </w:rPr>
-              <w:t>Quản lý Schema 14 bảng 3NF, Migration và Type-safe Client</w:t>
-            </w:r>
-          </w:p>
-        </w:tc>
-      </w:tr>
-      <w:tr>
-        <w:tc>
-          <w:tcPr>
-            <w:tcW w:type="dxa" w:w="2340"/>
-            <w:shd w:fill="F8FAFC"/>
-          </w:tcPr>
-          <w:p>
-            <w:r>
-              <w:rPr>
-                <w:rFonts w:ascii="Times New Roman" w:hAnsi="Times New Roman"/>
-                <w:sz w:val="19"/>
-              </w:rPr>
-              <w:t>Tầng Giao diện Người dùng (Frontend)</w:t>
-            </w:r>
-          </w:p>
-        </w:tc>
-        <w:tc>
-          <w:tcPr>
-            <w:tcW w:type="dxa" w:w="2340"/>
-            <w:shd w:fill="F8FAFC"/>
-          </w:tcPr>
-          <w:p>
-            <w:r>
-              <w:rPr>
-                <w:rFonts w:ascii="Times New Roman" w:hAnsi="Times New Roman"/>
-                <w:sz w:val="19"/>
-              </w:rPr>
-              <w:t>Next.js (App Router)</w:t>
-            </w:r>
-          </w:p>
-        </w:tc>
-        <w:tc>
-          <w:tcPr>
-            <w:tcW w:type="dxa" w:w="2340"/>
-            <w:shd w:fill="F8FAFC"/>
-          </w:tcPr>
-          <w:p>
-            <w:r>
-              <w:rPr>
-                <w:rFonts w:ascii="Times New Roman" w:hAnsi="Times New Roman"/>
-                <w:sz w:val="19"/>
-              </w:rPr>
-              <w:t>v14.x / v16.x</w:t>
-            </w:r>
-          </w:p>
-        </w:tc>
-        <w:tc>
-          <w:tcPr>
-            <w:tcW w:type="dxa" w:w="2340"/>
-            <w:shd w:fill="F8FAFC"/>
-          </w:tcPr>
-          <w:p>
-            <w:r>
-              <w:rPr>
-                <w:rFonts w:ascii="Times New Roman" w:hAnsi="Times New Roman"/>
-                <w:sz w:val="19"/>
-              </w:rPr>
-              <w:t>Xây dựng 23 màn hình SPA/SSR với TypeScript, Routing linh hoạt</w:t>
-            </w:r>
-          </w:p>
-        </w:tc>
-      </w:tr>
-      <w:tr>
-        <w:tc>
-          <w:tcPr>
-            <w:tcW w:type="dxa" w:w="2340"/>
-          </w:tcPr>
-          <w:p>
-            <w:r>
-              <w:rPr>
-                <w:rFonts w:ascii="Times New Roman" w:hAnsi="Times New Roman"/>
-                <w:sz w:val="19"/>
-              </w:rPr>
-              <w:t>Thiết kế Giao diện &amp; Trực quan</w:t>
-            </w:r>
-          </w:p>
-        </w:tc>
-        <w:tc>
-          <w:tcPr>
-            <w:tcW w:type="dxa" w:w="2340"/>
-          </w:tcPr>
-          <w:p>
-            <w:r>
-              <w:rPr>
-                <w:rFonts w:ascii="Times New Roman" w:hAnsi="Times New Roman"/>
-                <w:sz w:val="19"/>
-              </w:rPr>
-              <w:t>TailwindCSS + Lucide Icons</w:t>
-            </w:r>
-          </w:p>
-        </w:tc>
-        <w:tc>
-          <w:tcPr>
-            <w:tcW w:type="dxa" w:w="2340"/>
-          </w:tcPr>
-          <w:p>
-            <w:r>
-              <w:rPr>
-                <w:rFonts w:ascii="Times New Roman" w:hAnsi="Times New Roman"/>
-                <w:sz w:val="19"/>
-              </w:rPr>
-              <w:t>v3.4.x / v4.x</w:t>
-            </w:r>
-          </w:p>
-        </w:tc>
-        <w:tc>
-          <w:tcPr>
-            <w:tcW w:type="dxa" w:w="2340"/>
-          </w:tcPr>
-          <w:p>
-            <w:r>
-              <w:rPr>
-                <w:rFonts w:ascii="Times New Roman" w:hAnsi="Times New Roman"/>
-                <w:sz w:val="19"/>
-              </w:rPr>
-              <w:t>Hệ thống Design System hiện đại, Glassmorphism và Responsive đa thiết bị</w:t>
-            </w:r>
-          </w:p>
-        </w:tc>
-      </w:tr>
-      <w:tr>
-        <w:tc>
-          <w:tcPr>
-            <w:tcW w:type="dxa" w:w="2340"/>
-            <w:shd w:fill="F8FAFC"/>
-          </w:tcPr>
-          <w:p>
-            <w:r>
-              <w:rPr>
-                <w:rFonts w:ascii="Times New Roman" w:hAnsi="Times New Roman"/>
-                <w:sz w:val="19"/>
-              </w:rPr>
-              <w:t>Hệ Quản trị Cơ sở Dữ liệu</w:t>
-            </w:r>
-          </w:p>
-        </w:tc>
-        <w:tc>
-          <w:tcPr>
-            <w:tcW w:type="dxa" w:w="2340"/>
-            <w:shd w:fill="F8FAFC"/>
-          </w:tcPr>
-          <w:p>
-            <w:r>
-              <w:rPr>
-                <w:rFonts w:ascii="Times New Roman" w:hAnsi="Times New Roman"/>
-                <w:sz w:val="19"/>
-              </w:rPr>
-              <w:t>PostgreSQL (Neon.tech)</w:t>
-            </w:r>
-          </w:p>
-        </w:tc>
-        <w:tc>
-          <w:tcPr>
-            <w:tcW w:type="dxa" w:w="2340"/>
-            <w:shd w:fill="F8FAFC"/>
-          </w:tcPr>
-          <w:p>
-            <w:r>
-              <w:rPr>
-                <w:rFonts w:ascii="Times New Roman" w:hAnsi="Times New Roman"/>
-                <w:sz w:val="19"/>
-              </w:rPr>
-              <w:t>v15+ / v16+</w:t>
-            </w:r>
-          </w:p>
-        </w:tc>
-        <w:tc>
-          <w:tcPr>
-            <w:tcW w:type="dxa" w:w="2340"/>
-            <w:shd w:fill="F8FAFC"/>
-          </w:tcPr>
-          <w:p>
-            <w:r>
-              <w:rPr>
-                <w:rFonts w:ascii="Times New Roman" w:hAnsi="Times New Roman"/>
-                <w:sz w:val="19"/>
-              </w:rPr>
-              <w:t>CSDL quan hệ Serverless Cloud Database hoạt động 24/7</w:t>
-            </w:r>
-          </w:p>
-        </w:tc>
-      </w:tr>
-      <w:tr>
-        <w:tc>
-          <w:tcPr>
-            <w:tcW w:type="dxa" w:w="2340"/>
-          </w:tcPr>
-          <w:p>
-            <w:r>
-              <w:rPr>
-                <w:rFonts w:ascii="Times New Roman" w:hAnsi="Times New Roman"/>
-                <w:sz w:val="19"/>
-              </w:rPr>
-              <w:t>Động cơ Trí tuệ Nhân tạo (GenAI)</w:t>
-            </w:r>
-          </w:p>
-        </w:tc>
-        <w:tc>
-          <w:tcPr>
-            <w:tcW w:type="dxa" w:w="2340"/>
-          </w:tcPr>
-          <w:p>
-            <w:r>
-              <w:rPr>
-                <w:rFonts w:ascii="Times New Roman" w:hAnsi="Times New Roman"/>
-                <w:sz w:val="19"/>
-              </w:rPr>
-              <w:t>Google Gemini SDK</w:t>
-            </w:r>
-          </w:p>
-        </w:tc>
-        <w:tc>
-          <w:tcPr>
-            <w:tcW w:type="dxa" w:w="2340"/>
-          </w:tcPr>
-          <w:p>
-            <w:r>
-              <w:rPr>
-                <w:rFonts w:ascii="Times New Roman" w:hAnsi="Times New Roman"/>
-                <w:sz w:val="19"/>
-              </w:rPr>
-              <w:t>@google/genai</w:t>
-            </w:r>
-          </w:p>
-        </w:tc>
-        <w:tc>
-          <w:tcPr>
-            <w:tcW w:type="dxa" w:w="2340"/>
-          </w:tcPr>
-          <w:p>
-            <w:r>
-              <w:rPr>
-                <w:rFonts w:ascii="Times New Roman" w:hAnsi="Times New Roman"/>
-                <w:sz w:val="19"/>
-              </w:rPr>
-              <w:t>Tích hợp mô hình ngôn ngữ lớn (Gemini 2.5 Flash/Pro) vào 3 tính năng trợ giảng</w:t>
-            </w:r>
-          </w:p>
-        </w:tc>
-      </w:tr>
-      <w:tr>
-        <w:tc>
-          <w:tcPr>
-            <w:tcW w:type="dxa" w:w="2340"/>
-            <w:shd w:fill="F8FAFC"/>
-          </w:tcPr>
-          <w:p>
-            <w:r>
-              <w:rPr>
-                <w:rFonts w:ascii="Times New Roman" w:hAnsi="Times New Roman"/>
-                <w:sz w:val="19"/>
-              </w:rPr>
-              <w:t>Bảo mật &amp; Mã hóa Danh tính</w:t>
-            </w:r>
-          </w:p>
-        </w:tc>
-        <w:tc>
-          <w:tcPr>
-            <w:tcW w:type="dxa" w:w="2340"/>
-            <w:shd w:fill="F8FAFC"/>
-          </w:tcPr>
-          <w:p>
-            <w:r>
-              <w:rPr>
-                <w:rFonts w:ascii="Times New Roman" w:hAnsi="Times New Roman"/>
-                <w:sz w:val="19"/>
-              </w:rPr>
-              <w:t>Argon2 + JWT</w:t>
-            </w:r>
-          </w:p>
-        </w:tc>
-        <w:tc>
-          <w:tcPr>
-            <w:tcW w:type="dxa" w:w="2340"/>
-            <w:shd w:fill="F8FAFC"/>
-          </w:tcPr>
-          <w:p>
-            <w:r>
-              <w:rPr>
-                <w:rFonts w:ascii="Times New Roman" w:hAnsi="Times New Roman"/>
-                <w:sz w:val="19"/>
-              </w:rPr>
-              <w:t>argon2, @nestjs/jwt</w:t>
-            </w:r>
-          </w:p>
-        </w:tc>
-        <w:tc>
-          <w:tcPr>
-            <w:tcW w:type="dxa" w:w="2340"/>
-            <w:shd w:fill="F8FAFC"/>
-          </w:tcPr>
-          <w:p>
-            <w:r>
-              <w:rPr>
-                <w:rFonts w:ascii="Times New Roman" w:hAnsi="Times New Roman"/>
-                <w:sz w:val="19"/>
-              </w:rPr>
-              <w:t>Băm mật khẩu chống brute-force và cấp phát Token xác thực Stateless</w:t>
-            </w:r>
-          </w:p>
-        </w:tc>
-      </w:tr>
-    </w:tbl>
     <w:p>
       <w:pPr>
-        <w:spacing w:before="60" w:after="160"/>
-        <w:jc w:val="center"/>
+        <w:spacing w:before="200" w:after="80"/>
       </w:pPr>
       <w:r>
         <w:rPr>
           <w:rFonts w:ascii="Times New Roman" w:hAnsi="Times New Roman"/>
-          <w:i/>
-          <w:sz w:val="22"/>
+          <w:b/>
+          <w:color w:val="0F172A"/>
+          <w:sz w:val="26"/>
         </w:rPr>
-        <w:t>Bảng 8.1: Bảng tổng hợp danh mục công nghệ và phần mềm sử dụng trong dự án</w:t>
+        <w:t>8.1.1 Cấu hình Biến Môi trường (.env)</w:t>
+      </w:r>
+    </w:p>
+    <w:p>
+      <w:pPr>
+        <w:spacing w:line="288" w:lineRule="auto" w:after="120"/>
+        <w:jc w:val="both"/>
+      </w:pPr>
+      <w:r>
+        <w:rPr>
+          <w:rFonts w:ascii="Times New Roman" w:hAnsi="Times New Roman"/>
+          <w:sz w:val="26"/>
+        </w:rPr>
+        <w:t>Toàn bộ các thông số kết nối cơ sở dữ liệu, khóa bảo mật JWT và API Key dịch vụ AI được cô lập trong file .env phía máy chủ để đảm bảo an toàn thông tin:</w:t>
+      </w:r>
+    </w:p>
+    <w:p>
+      <w:pPr>
+        <w:pStyle w:val="ListBullet"/>
+        <w:spacing w:line="288" w:lineRule="auto" w:after="80"/>
+      </w:pPr>
+      <w:r>
+        <w:rPr>
+          <w:rFonts w:ascii="Times New Roman" w:hAnsi="Times New Roman"/>
+          <w:b/>
+          <w:sz w:val="26"/>
+        </w:rPr>
+        <w:t xml:space="preserve">• </w:t>
+      </w:r>
+      <w:r>
+        <w:rPr>
+          <w:rFonts w:ascii="Times New Roman" w:hAnsi="Times New Roman"/>
+          <w:sz w:val="26"/>
+        </w:rPr>
+        <w:t>DATABASE_URL: Chuỗi kết nối bảo mật SSL tới hệ quản trị CSDL Neon Serverless PostgreSQL qua kênh Pooling tự động.</w:t>
+      </w:r>
+    </w:p>
+    <w:p>
+      <w:pPr>
+        <w:pStyle w:val="ListBullet"/>
+        <w:spacing w:line="288" w:lineRule="auto" w:after="80"/>
+      </w:pPr>
+      <w:r>
+        <w:rPr>
+          <w:rFonts w:ascii="Times New Roman" w:hAnsi="Times New Roman"/>
+          <w:b/>
+          <w:sz w:val="26"/>
+        </w:rPr>
+        <w:t xml:space="preserve">• </w:t>
+      </w:r>
+      <w:r>
+        <w:rPr>
+          <w:rFonts w:ascii="Times New Roman" w:hAnsi="Times New Roman"/>
+          <w:sz w:val="26"/>
+        </w:rPr>
+        <w:t>JWT_SECRET &amp; JWT_EXPIRES_IN: Khóa bí mật dùng để ký chữ ký số HMAC-SHA256 cho mã Token xác thực của 4 vai trò (thời hạn 24 giờ).</w:t>
+      </w:r>
+    </w:p>
+    <w:p>
+      <w:pPr>
+        <w:pStyle w:val="ListBullet"/>
+        <w:spacing w:line="288" w:lineRule="auto" w:after="80"/>
+      </w:pPr>
+      <w:r>
+        <w:rPr>
+          <w:rFonts w:ascii="Times New Roman" w:hAnsi="Times New Roman"/>
+          <w:b/>
+          <w:sz w:val="26"/>
+        </w:rPr>
+        <w:t xml:space="preserve">• </w:t>
+      </w:r>
+      <w:r>
+        <w:rPr>
+          <w:rFonts w:ascii="Times New Roman" w:hAnsi="Times New Roman"/>
+          <w:sz w:val="26"/>
+        </w:rPr>
+        <w:t>GEMINI_API_KEY: Khóa truy cập Google AI Studio để gọi mô hình ngôn ngữ lớn Google Gemini.</w:t>
+      </w:r>
+    </w:p>
+    <w:p>
+      <w:pPr>
+        <w:spacing w:before="200" w:after="80"/>
+      </w:pPr>
+      <w:r>
+        <w:rPr>
+          <w:rFonts w:ascii="Times New Roman" w:hAnsi="Times New Roman"/>
+          <w:b/>
+          <w:color w:val="0F172A"/>
+          <w:sz w:val="26"/>
+        </w:rPr>
+        <w:t>8.1.2 Cấu trúc Thư mục Dự án Monorepo</w:t>
+      </w:r>
+    </w:p>
+    <w:p>
+      <w:pPr>
+        <w:spacing w:line="288" w:lineRule="auto" w:after="120"/>
+        <w:jc w:val="both"/>
+      </w:pPr>
+      <w:r>
+        <w:rPr>
+          <w:rFonts w:ascii="Times New Roman" w:hAnsi="Times New Roman"/>
+          <w:sz w:val="26"/>
+        </w:rPr>
+        <w:t>Mã nguồn dự án được tổ chức khoa học theo mô hình Monorepo gồm 2 phân hệ chính:</w:t>
+      </w:r>
+    </w:p>
+    <w:p>
+      <w:pPr>
+        <w:pStyle w:val="ListBullet"/>
+        <w:spacing w:line="288" w:lineRule="auto" w:after="80"/>
+      </w:pPr>
+      <w:r>
+        <w:rPr>
+          <w:rFonts w:ascii="Times New Roman" w:hAnsi="Times New Roman"/>
+          <w:b/>
+          <w:sz w:val="26"/>
+        </w:rPr>
+        <w:t xml:space="preserve">• </w:t>
+      </w:r>
+      <w:r>
+        <w:rPr>
+          <w:rFonts w:ascii="Times New Roman" w:hAnsi="Times New Roman"/>
+          <w:sz w:val="26"/>
+        </w:rPr>
+        <w:t>backend/: Chứa 8 module nghiệp vụ NestJS (auth, users, courses, classes, enrollments, attendances, grades, stats, ai) cùng thư mục prisma/ quản lý Database Schema.</w:t>
+      </w:r>
+    </w:p>
+    <w:p>
+      <w:pPr>
+        <w:pStyle w:val="ListBullet"/>
+        <w:spacing w:line="288" w:lineRule="auto" w:after="80"/>
+      </w:pPr>
+      <w:r>
+        <w:rPr>
+          <w:rFonts w:ascii="Times New Roman" w:hAnsi="Times New Roman"/>
+          <w:b/>
+          <w:sz w:val="26"/>
+        </w:rPr>
+        <w:t xml:space="preserve">• </w:t>
+      </w:r>
+      <w:r>
+        <w:rPr>
+          <w:rFonts w:ascii="Times New Roman" w:hAnsi="Times New Roman"/>
+          <w:sz w:val="26"/>
+        </w:rPr>
+        <w:t>frontend/: Chứa 23 màn hình giao diện Next.js App Router (thư mục app/admin, app/teacher, app/student, app/staff), tích hợp TailwindCSS và bộ điều hướng Axios client.</w:t>
       </w:r>
     </w:p>
     <w:p>
@@ -707,7 +214,7 @@
           <w:color w:val="1E3A8A"/>
           <w:sz w:val="28"/>
         </w:rPr>
-        <w:t>8.2 Cài Đặt và Khởi Tạo Cơ Sở Dữ Liệu</w:t>
+        <w:t>8.2 Khởi Tạo Cơ Sở Dữ Liệu &amp; Nạp Dữ Liệu Mẫu (Database Seeding)</w:t>
       </w:r>
     </w:p>
     <w:p>
@@ -733,7 +240,7 @@
           <w:rFonts w:ascii="Times New Roman" w:hAnsi="Times New Roman"/>
           <w:sz w:val="26"/>
         </w:rPr>
-        <w:t>Quy trình khởi tạo CSDL được thực hiện qua công cụ Prisma ORM với 14 bảng quan hệ chuẩn 3NF (nguoi_dung, ho_so_hoc_vien, ho_so_giao_vien, khoa_hoc, lop_hoc, lich_hoc, phan_cong_giao_vien, dang_ky_hoc, hoa_don, thanh_toan, buoi_hoc, ban_ghi_diem_danh, ket_qua_hoc_tap, yeu_cau_ai):</w:t>
+        <w:t>Quy trình khởi tạo CSDL được thực hiện hoàn toàn tự động qua công cụ Prisma ORM:</w:t>
       </w:r>
     </w:p>
     <w:p>
@@ -747,14 +254,14 @@
           <w:b/>
           <w:sz w:val="26"/>
         </w:rPr>
-        <w:t xml:space="preserve">• </w:t>
+        <w:t xml:space="preserve">Bước 1: </w:t>
       </w:r>
       <w:r>
         <w:rPr>
           <w:rFonts w:ascii="Times New Roman" w:hAnsi="Times New Roman"/>
           <w:sz w:val="26"/>
         </w:rPr>
-        <w:t>Đồng bộ Schema: Chạy lệnh npx prisma db push để tạo toàn bộ bảng, khóa chính, khóa ngoại và ràng buộc toàn vẹn trên Neon Cloud.</w:t>
+        <w:t>1. Đồng bộ Schema: Thực thi lệnh npx prisma db push để khởi tạo 14 bảng quan hệ chuẩn 3NF, thiết lập đầy đủ khóa chính (PK), khóa ngoại (FK) và các ràng buộc toàn vẹn.</w:t>
       </w:r>
     </w:p>
     <w:p>
@@ -768,14 +275,14 @@
           <w:b/>
           <w:sz w:val="26"/>
         </w:rPr>
-        <w:t xml:space="preserve">• </w:t>
+        <w:t xml:space="preserve">Bước 2: </w:t>
       </w:r>
       <w:r>
         <w:rPr>
           <w:rFonts w:ascii="Times New Roman" w:hAnsi="Times New Roman"/>
           <w:sz w:val="26"/>
         </w:rPr>
-        <w:t>Nạp dữ liệu mẫu ban đầu: Chạy script npm run db:seed để nạp sẵn tài khoản cho 4 vai trò (admin01, teacher01, teacher02, staff01, student01, student02), các khóa học và lớp học ban đầu.</w:t>
+        <w:t>2. Nạp dữ liệu mẫu: Thực thi lệnh npm run db:seed để nạp sẵn danh mục 6 tài khoản người dùng cho 4 vai trò (admin01, teacher01, teacher02, staff01, student01, student02), các khóa học và lớp học ban đầu với mật khẩu băm Argon2 chuẩn an toàn.</w:t>
       </w:r>
     </w:p>
     <w:p>
@@ -789,7 +296,7 @@
           <w:color w:val="1E3A8A"/>
           <w:sz w:val="28"/>
         </w:rPr>
-        <w:t>8.3 Kết Quả Cài Đặt Các Phân Hệ Chức Năng Chính</w:t>
+        <w:t>8.3 Kết Quả Cài Đặt Giao Diện &amp; Các Phân Hệ Chức Năng Chính</w:t>
       </w:r>
     </w:p>
     <w:p>
@@ -816,7 +323,7 @@
           <w:color w:val="0F172A"/>
           <w:sz w:val="26"/>
         </w:rPr>
-        <w:t>8.3.1 Phân Hệ 1: Đăng Nhập và Phân Quyền RBAC (Role-Based Access Control)</w:t>
+        <w:t>8.3.1 Phân Hệ 1: Đăng Nhập &amp; Bàn Làm Việc Quản Trị Trung Tâm</w:t>
       </w:r>
     </w:p>
     <w:p>
@@ -829,7 +336,7 @@
           <w:rFonts w:ascii="Times New Roman" w:hAnsi="Times New Roman"/>
           <w:sz w:val="26"/>
         </w:rPr>
-        <w:t>Màn hình đăng nhập (SCR-AUTH-01) tích hợp sẵn các nút chọn nhanh tài khoản mẫu cho 4 vai trò, tự động phân giải vai trò qua JWT và chuyển hướng chính xác về Dashboard Quản trị (SCR-ADM-01) với các chỉ số thống kê tổng quan:</w:t>
+        <w:t>Màn hình đăng nhập (SCR-AUTH-01) tích hợp sẵn các nút chọn nhanh tài khoản mẫu cho 4 vai trò, tự động phân giải vai trò qua JWT và chuyển hướng chính xác về Dashboard Quản trị (SCR-ADM-01) với các chỉ số hoạt động tổng quan:</w:t>
       </w:r>
     </w:p>
     <w:p>

</xml_diff>

<commit_message>
docs: refine Chapter 8 structure and phrasing to align with academic standards
</commit_message>
<xml_diff>
--- a/docs/design/CHUONG_8_9_BAO_CAO_HOAN_CHINH.docx
+++ b/docs/design/CHUONG_8_9_BAO_CAO_HOAN_CHINH.docx
@@ -145,7 +145,7 @@
           <w:color w:val="0F172A"/>
           <w:sz w:val="26"/>
         </w:rPr>
-        <w:t>8.1.2 Cấu trúc Thư mục Dự án Monorepo</w:t>
+        <w:t>8.1.2 Cấu trúc Tổ chức Mã nguồn Dự án</w:t>
       </w:r>
     </w:p>
     <w:p>
@@ -158,7 +158,7 @@
           <w:rFonts w:ascii="Times New Roman" w:hAnsi="Times New Roman"/>
           <w:sz w:val="26"/>
         </w:rPr>
-        <w:t>Mã nguồn dự án được tổ chức khoa học theo mô hình Monorepo gồm 2 phân hệ chính:</w:t>
+        <w:t>Mã nguồn hệ thống được phân rã khoa học thành các thư mục chức năng chuyên biệt:</w:t>
       </w:r>
     </w:p>
     <w:p>
@@ -179,7 +179,7 @@
           <w:rFonts w:ascii="Times New Roman" w:hAnsi="Times New Roman"/>
           <w:sz w:val="26"/>
         </w:rPr>
-        <w:t>backend/: Chứa 8 module nghiệp vụ NestJS (auth, users, courses, classes, enrollments, attendances, grades, stats, ai) cùng thư mục prisma/ quản lý Database Schema.</w:t>
+        <w:t>backend/: Chứa toàn bộ mã nguồn xử lý nghiệp vụ Backend xây dựng bằng NestJS gồm 8 module (auth, users, courses, classes, enrollments, attendances, grades, stats, ai) cùng thư mục prisma/ quản lý Database Schema 3NF.</w:t>
       </w:r>
     </w:p>
     <w:p>
@@ -200,7 +200,28 @@
           <w:rFonts w:ascii="Times New Roman" w:hAnsi="Times New Roman"/>
           <w:sz w:val="26"/>
         </w:rPr>
-        <w:t>frontend/: Chứa 23 màn hình giao diện Next.js App Router (thư mục app/admin, app/teacher, app/student, app/staff), tích hợp TailwindCSS và bộ điều hướng Axios client.</w:t>
+        <w:t>frontend/: Chứa 23 màn hình giao diện người dùng Next.js App Router (thư mục app/admin, app/teacher, app/student, app/staff), tích hợp TailwindCSS và hệ thống định tuyến RBAC.</w:t>
+      </w:r>
+    </w:p>
+    <w:p>
+      <w:pPr>
+        <w:pStyle w:val="ListBullet"/>
+        <w:spacing w:line="288" w:lineRule="auto" w:after="80"/>
+      </w:pPr>
+      <w:r>
+        <w:rPr>
+          <w:rFonts w:ascii="Times New Roman" w:hAnsi="Times New Roman"/>
+          <w:b/>
+          <w:sz w:val="26"/>
+        </w:rPr>
+        <w:t xml:space="preserve">• </w:t>
+      </w:r>
+      <w:r>
+        <w:rPr>
+          <w:rFonts w:ascii="Times New Roman" w:hAnsi="Times New Roman"/>
+          <w:sz w:val="26"/>
+        </w:rPr>
+        <w:t>docs/: Chứa toàn bộ tài liệu thiết kế hệ thống, sơ đồ kỹ thuật UML/ERD và cẩm nang hướng dẫn vận hành.</w:t>
       </w:r>
     </w:p>
     <w:p>
@@ -261,7 +282,7 @@
           <w:rFonts w:ascii="Times New Roman" w:hAnsi="Times New Roman"/>
           <w:sz w:val="26"/>
         </w:rPr>
-        <w:t>1. Đồng bộ Schema: Thực thi lệnh npx prisma db push để khởi tạo 14 bảng quan hệ chuẩn 3NF, thiết lập đầy đủ khóa chính (PK), khóa ngoại (FK) và các ràng buộc toàn vẹn.</w:t>
+        <w:t>Đồng bộ Schema: Thực thi lệnh npx prisma db push để khởi tạo 14 bảng quan hệ chuẩn 3NF, thiết lập đầy đủ khóa chính (PK), khóa ngoại (FK) và các ràng buộc toàn vẹn trên Neon Cloud.</w:t>
       </w:r>
     </w:p>
     <w:p>
@@ -282,7 +303,7 @@
           <w:rFonts w:ascii="Times New Roman" w:hAnsi="Times New Roman"/>
           <w:sz w:val="26"/>
         </w:rPr>
-        <w:t>2. Nạp dữ liệu mẫu: Thực thi lệnh npm run db:seed để nạp sẵn danh mục 6 tài khoản người dùng cho 4 vai trò (admin01, teacher01, teacher02, staff01, student01, student02), các khóa học và lớp học ban đầu với mật khẩu băm Argon2 chuẩn an toàn.</w:t>
+        <w:t>Nạp dữ liệu mẫu: Thực thi lệnh npm run db:seed để nạp sẵn danh mục 6 tài khoản người dùng cho 4 vai trò (admin01, teacher01, teacher02, staff01, student01, student02), các khóa học và lớp học ban đầu với mật khẩu băm Argon2 chuẩn an toàn.</w:t>
       </w:r>
     </w:p>
     <w:p>

</xml_diff>